<commit_message>
Improve flowchart: replace raw Mermaid text with rendered visual diagram in Word document
Agent-Logs-Url: https://github.com/kayyachy/fastAPI/sessions/a9e1d8d0-f6c4-4729-a2c9-f2a685903826

Co-authored-by: kayyachy <196779117+kayyachy@users.noreply.github.com>
</commit_message>
<xml_diff>
--- a/afwijsredenen-flowchart.docx
+++ b/afwijsredenen-flowchart.docx
@@ -5,157 +5,69 @@
     <w:p>
       <w:pPr>
         <w:pStyle w:val="Heading1"/>
+        <w:jc w:val="center"/>
       </w:pPr>
       <w:r>
         <w:t>Verwerkingsstroom Afwijsredenen</w:t>
       </w:r>
     </w:p>
     <w:p>
+      <w:pPr>
+        <w:jc w:val="center"/>
+      </w:pPr>
       <w:r>
-        <w:t>Dit diagram visualiseert de volledige verwerkingsstroom van afwijsredenen, van gebruikersinteractie tot weergave in de grid.</w:t>
+        <w:t>Dit document visualiseert de volledige verwerkingsstroom van afwijsredenen, van gebruikersinteractie tot weergave in de grid.</w:t>
       </w:r>
     </w:p>
+    <w:p/>
     <w:p>
       <w:pPr>
         <w:pStyle w:val="Heading2"/>
       </w:pPr>
       <w:r>
-        <w:t>Flowchart Diagram (Mermaid)</w:t>
-      </w:r>
-    </w:p>
-    <w:p>
-      <w:r>
-        <w:t>Het onderstaande diagram is gemaakt met Mermaid. Plak de code in https://mermaid.live om het diagram te bekijken.</w:t>
+        <w:t>Flowchart</w:t>
       </w:r>
     </w:p>
     <w:p>
       <w:pPr>
-        <w:ind w:left="360"/>
+        <w:jc w:val="center"/>
       </w:pPr>
       <w:r>
-        <w:rPr>
-          <w:rFonts w:ascii="Courier New" w:hAnsi="Courier New"/>
-          <w:sz w:val="16"/>
-        </w:rPr>
-        <w:t>flowchart TD</w:t>
-        <w:br/>
-        <w:t xml:space="preserve">    Start([👤 Gebruiker klikt op Afwijsredenen Tab]) --&gt; CheckTab{Tab al geïnitialiseerd?}</w:t>
-        <w:br/>
-        <w:br/>
-        <w:t xml:space="preserve">    CheckTab --&gt;|Nee| CreateTab[📋 Creëer AfwijsredenenSubTab]</w:t>
-        <w:br/>
-        <w:t xml:space="preserve">    CheckTab --&gt;|Ja| ShowTab[👁️ Toon bestaande tab]</w:t>
-        <w:br/>
-        <w:br/>
-        <w:t xml:space="preserve">    CreateTab --&gt; CreatePanel[🔧 Creëer NOWAfwijsredenenGridPanel]</w:t>
-        <w:br/>
-        <w:t xml:space="preserve">    CreatePanel --&gt; CreateGrid[📊 Creëer NOWAfwijsredenenGrid]</w:t>
-        <w:br/>
-        <w:t xml:space="preserve">    CreateGrid --&gt; ConfigGrid[⚙️ Configureer Grid - setAllRowsVisible true - SelectionMode NONE - Kolom: Omschrijving]</w:t>
-        <w:br/>
-        <w:t xml:space="preserve">    ConfigGrid --&gt; SetDataProvider[🔌 Setup Data Provider setItemsPageable]</w:t>
-        <w:br/>
-        <w:br/>
-        <w:t xml:space="preserve">    ShowTab --&gt; SetDataProvider</w:t>
-        <w:br/>
-        <w:br/>
-        <w:t xml:space="preserve">    SetDataProvider --&gt; TabVisible[✅ Tab wordt zichtbaar]</w:t>
-        <w:br/>
-        <w:t xml:space="preserve">    TabVisible --&gt; TriggerFetch[⚡ Vaadin triggert data fetch]</w:t>
-        <w:br/>
-        <w:t xml:space="preserve">    TriggerFetch --&gt; FetchData[📞 fetchData wordt aangeroepen]</w:t>
-        <w:br/>
-        <w:br/>
-        <w:t xml:space="preserve">    FetchData --&gt; GetLHNR{LHNR beschikbaar?}</w:t>
-        <w:br/>
-        <w:br/>
-        <w:t xml:space="preserve">    GetLHNR --&gt;|Nee| EmptyList[📭 Return lege lijst]</w:t>
-        <w:br/>
-        <w:t xml:space="preserve">    EmptyList --&gt; ShowEmpty[💭 Grid toont Geen gegevens beschikbaar]</w:t>
-        <w:br/>
-        <w:t xml:space="preserve">    ShowEmpty --&gt; End([🏁 Einde])</w:t>
-        <w:br/>
-        <w:br/>
-        <w:t xml:space="preserve">    GetLHNR --&gt;|Ja| LogLHNR[📝 Log: Zoek afwijsredenen voor LHNR]</w:t>
-        <w:br/>
-        <w:t xml:space="preserve">    LogLHNR --&gt; CallService[🔄 Roep NOWService aan findAfwijsredenen config lhnr]</w:t>
-        <w:br/>
-        <w:t xml:space="preserve">    CallService --&gt; ServiceGetDao[🎯 Service haalt AfwijsredenenDao op]</w:t>
-        <w:br/>
-        <w:t xml:space="preserve">    ServiceGetDao --&gt; DaoQuery[🗄️ DAO bepaalt query op basis van regelingId]</w:t>
-        <w:br/>
-        <w:br/>
-        <w:t xml:space="preserve">    DaoQuery --&gt; CheckRegelingId{RegelingId == 1?}</w:t>
-        <w:br/>
-        <w:br/>
-        <w:t xml:space="preserve">    CheckRegelingId --&gt;|Ja| UseNOW1[📄 Gebruik RAN_NOW1_AFWIJSREDENEN_VW]</w:t>
-        <w:br/>
-        <w:t xml:space="preserve">    CheckRegelingId --&gt;|Nee| UseNOWX[📄 Gebruik RAN_NOWX_AFWIJSREDENEN_VW]</w:t>
-        <w:br/>
-        <w:br/>
-        <w:t xml:space="preserve">    UseNOW1 --&gt; CreateQuery1[🔨 Create Native Query SELECT ROWNUM as ID, LHNR, 1 AS NOW_REGELING_ID, OMSCHRIJVING, PRIO WHERE LHNR = ?]</w:t>
-        <w:br/>
-        <w:t xml:space="preserve">    UseNOWX --&gt; CreateQueryX[🔨 Create Native Query SELECT ROWNUM as ID, LHNR, NOW_REGELING_ID, OMSCHRIJVING, PRIO WHERE LHNR = ? AND NOW_REGELING_ID = ?]</w:t>
-        <w:br/>
-        <w:br/>
-        <w:t xml:space="preserve">    CreateQuery1 --&gt; BindParams1[🔗 Bind parameter: LHNR]</w:t>
-        <w:br/>
-        <w:t xml:space="preserve">    CreateQueryX --&gt; BindParamsX[🔗 Bind parameters: LHNR, regelingId]</w:t>
-        <w:br/>
-        <w:br/>
-        <w:t xml:space="preserve">    BindParams1 --&gt; ExecuteSQL</w:t>
-        <w:br/>
-        <w:t xml:space="preserve">    BindParamsX --&gt; ExecuteSQL[💾 Execute SQL query naar Oracle Database]</w:t>
-        <w:br/>
-        <w:br/>
-        <w:t xml:space="preserve">    ExecuteSQL --&gt; GetResults[📊 Database retourneert resultset]</w:t>
-        <w:br/>
-        <w:t xml:space="preserve">    GetResults --&gt; StreamEntities[🌊 DAO retourneert Stream&lt;NOWAfwijsredenEntity&gt;]</w:t>
-        <w:br/>
-        <w:t xml:space="preserve">    StreamEntities --&gt; MapToBean[🔄 Service mapt Entity naar Bean via CopyProperties]</w:t>
-        <w:br/>
-        <w:t xml:space="preserve">    MapToBean --&gt; CollectList[📦 Collect Stream naar List&lt;NOWAfwijsredenBean&gt;]</w:t>
-        <w:br/>
-        <w:t xml:space="preserve">    CollectList --&gt; LogResults[📝 Log: aantal resultaten]</w:t>
-        <w:br/>
-        <w:t xml:space="preserve">    LogResults --&gt; ReturnToGrid[⬆️ Return lijst naar Grid]</w:t>
-        <w:br/>
-        <w:t xml:space="preserve">    ReturnToGrid --&gt; GridRender[🎨 Grid rendert data]</w:t>
-        <w:br/>
-        <w:t xml:space="preserve">    GridRender --&gt; ShowRows[📋 Elke bean wordt als rij getoond]</w:t>
-        <w:br/>
-        <w:t xml:space="preserve">    ShowRows --&gt; AdjustHeight[📏 Grid past hoogte aan aan aantal rijen]</w:t>
-        <w:br/>
-        <w:t xml:space="preserve">    AdjustHeight --&gt; UserSees[👀 Gebruiker ziet afwijsredenen in grid]</w:t>
-        <w:br/>
-        <w:t xml:space="preserve">    UserSees --&gt; End</w:t>
-        <w:br/>
-        <w:br/>
-        <w:t xml:space="preserve">    style Start fill:#e1f5e1,stroke:#4caf50,color:#000</w:t>
-        <w:br/>
-        <w:t xml:space="preserve">    style End fill:#ffe1e1,stroke:#f44336,color:#000</w:t>
-        <w:br/>
-        <w:t xml:space="preserve">    style ShowEmpty fill:#ffe1e1,stroke:#f44336,color:#000</w:t>
-        <w:br/>
-        <w:t xml:space="preserve">    style CheckTab fill:#fff4e1,stroke:#ff9800,color:#000</w:t>
-        <w:br/>
-        <w:t xml:space="preserve">    style GetLHNR fill:#fff4e1,stroke:#ff9800,color:#000</w:t>
-        <w:br/>
-        <w:t xml:space="preserve">    style CheckRegelingId fill:#fff4e1,stroke:#ff9800,color:#000</w:t>
-        <w:br/>
-        <w:t xml:space="preserve">    style ExecuteSQL fill:#e1e5ff,stroke:#3f51b5,color:#000</w:t>
-        <w:br/>
-        <w:t xml:space="preserve">    style UseNOW1 fill:#e1e5ff,stroke:#3f51b5,color:#000</w:t>
-        <w:br/>
-        <w:t xml:space="preserve">    style UseNOWX fill:#e1e5ff,stroke:#3f51b5,color:#000</w:t>
-        <w:br/>
-        <w:t xml:space="preserve">    style CreateQuery1 fill:#e1e5ff,stroke:#3f51b5,color:#000</w:t>
-        <w:br/>
-        <w:t xml:space="preserve">    style CreateQueryX fill:#e1e5ff,stroke:#3f51b5,color:#000</w:t>
-        <w:br/>
-        <w:t xml:space="preserve">    style UserSees fill:#e1f5e1,stroke:#4caf50,color:#000</w:t>
+        <w:drawing>
+          <wp:inline xmlns:a="http://schemas.openxmlformats.org/drawingml/2006/main" xmlns:pic="http://schemas.openxmlformats.org/drawingml/2006/picture">
+            <wp:extent cx="5669280" cy="25290468"/>
+            <wp:docPr id="1" name="Picture 1"/>
+            <wp:cNvGraphicFramePr>
+              <a:graphicFrameLocks noChangeAspect="1"/>
+            </wp:cNvGraphicFramePr>
+            <a:graphic>
+              <a:graphicData uri="http://schemas.openxmlformats.org/drawingml/2006/picture">
+                <pic:pic>
+                  <pic:nvPicPr>
+                    <pic:cNvPr id="0" name="afwijsredenen_flowchart.png"/>
+                    <pic:cNvPicPr/>
+                  </pic:nvPicPr>
+                  <pic:blipFill>
+                    <a:blip r:embed="rId9"/>
+                    <a:stretch>
+                      <a:fillRect/>
+                    </a:stretch>
+                  </pic:blipFill>
+                  <pic:spPr>
+                    <a:xfrm>
+                      <a:off x="0" y="0"/>
+                      <a:ext cx="5669280" cy="25290468"/>
+                    </a:xfrm>
+                    <a:prstGeom prst="rect"/>
+                  </pic:spPr>
+                </pic:pic>
+              </a:graphicData>
+            </a:graphic>
+          </wp:inline>
+        </w:drawing>
       </w:r>
     </w:p>
+    <w:p/>
     <w:p>
       <w:pPr>
         <w:pStyle w:val="Heading2"/>
@@ -171,26 +83,40 @@
         <w:tblLook w:firstColumn="1" w:firstRow="1" w:lastColumn="0" w:lastRow="0" w:noHBand="0" w:noVBand="1" w:val="04A0"/>
       </w:tblPr>
       <w:tblGrid>
-        <w:gridCol w:w="4320"/>
-        <w:gridCol w:w="4320"/>
+        <w:gridCol w:w="3216"/>
+        <w:gridCol w:w="3216"/>
+        <w:gridCol w:w="3216"/>
       </w:tblGrid>
       <w:tr>
         <w:tc>
           <w:tcPr>
-            <w:tcW w:type="dxa" w:w="4320"/>
+            <w:tcW w:type="dxa" w:w="3216"/>
           </w:tcPr>
           <w:p>
             <w:r>
               <w:rPr>
                 <w:b/>
               </w:rPr>
-              <w:t>Kleur</w:t>
+              <w:t>Vorm / kleur</w:t>
             </w:r>
           </w:p>
         </w:tc>
         <w:tc>
           <w:tcPr>
-            <w:tcW w:type="dxa" w:w="4320"/>
+            <w:tcW w:type="dxa" w:w="3216"/>
+          </w:tcPr>
+          <w:p>
+            <w:r>
+              <w:rPr>
+                <w:b/>
+              </w:rPr>
+              <w:t>Hex</w:t>
+            </w:r>
+          </w:p>
+        </w:tc>
+        <w:tc>
+          <w:tcPr>
+            <w:tcW w:type="dxa" w:w="3216"/>
           </w:tcPr>
           <w:p>
             <w:r>
@@ -205,21 +131,31 @@
       <w:tr>
         <w:tc>
           <w:tcPr>
-            <w:tcW w:type="dxa" w:w="4320"/>
+            <w:tcW w:type="dxa" w:w="3216"/>
           </w:tcPr>
           <w:p>
             <w:r>
-              <w:t>🟢 Groen</w:t>
+              <w:t>🟢 Groen (ellips)</w:t>
             </w:r>
           </w:p>
         </w:tc>
         <w:tc>
           <w:tcPr>
-            <w:tcW w:type="dxa" w:w="4320"/>
+            <w:tcW w:type="dxa" w:w="3216"/>
           </w:tcPr>
           <w:p>
             <w:r>
-              <w:t>Start / Succes</w:t>
+              <w:t>#c8e6c9</w:t>
+            </w:r>
+          </w:p>
+        </w:tc>
+        <w:tc>
+          <w:tcPr>
+            <w:tcW w:type="dxa" w:w="3216"/>
+          </w:tcPr>
+          <w:p>
+            <w:r>
+              <w:t>Start / succes / gebruiker ziet resultaat</w:t>
             </w:r>
           </w:p>
         </w:tc>
@@ -227,21 +163,31 @@
       <w:tr>
         <w:tc>
           <w:tcPr>
-            <w:tcW w:type="dxa" w:w="4320"/>
+            <w:tcW w:type="dxa" w:w="3216"/>
           </w:tcPr>
           <w:p>
             <w:r>
-              <w:t>🔴 Rood</w:t>
+              <w:t>🔴 Rood (ellips)</w:t>
             </w:r>
           </w:p>
         </w:tc>
         <w:tc>
           <w:tcPr>
-            <w:tcW w:type="dxa" w:w="4320"/>
+            <w:tcW w:type="dxa" w:w="3216"/>
           </w:tcPr>
           <w:p>
             <w:r>
-              <w:t>Einde / Fout / Lege staat</w:t>
+              <w:t>#ffcdd2</w:t>
+            </w:r>
+          </w:p>
+        </w:tc>
+        <w:tc>
+          <w:tcPr>
+            <w:tcW w:type="dxa" w:w="3216"/>
+          </w:tcPr>
+          <w:p>
+            <w:r>
+              <w:t>Einde / fout / lege staat</w:t>
             </w:r>
           </w:p>
         </w:tc>
@@ -249,17 +195,27 @@
       <w:tr>
         <w:tc>
           <w:tcPr>
-            <w:tcW w:type="dxa" w:w="4320"/>
+            <w:tcW w:type="dxa" w:w="3216"/>
           </w:tcPr>
           <w:p>
             <w:r>
-              <w:t>🟡 Geel</w:t>
+              <w:t>🟡 Geel (diamond)</w:t>
             </w:r>
           </w:p>
         </w:tc>
         <w:tc>
           <w:tcPr>
-            <w:tcW w:type="dxa" w:w="4320"/>
+            <w:tcW w:type="dxa" w:w="3216"/>
+          </w:tcPr>
+          <w:p>
+            <w:r>
+              <w:t>#fff9c4</w:t>
+            </w:r>
+          </w:p>
+        </w:tc>
+        <w:tc>
+          <w:tcPr>
+            <w:tcW w:type="dxa" w:w="3216"/>
           </w:tcPr>
           <w:p>
             <w:r>
@@ -271,26 +227,69 @@
       <w:tr>
         <w:tc>
           <w:tcPr>
-            <w:tcW w:type="dxa" w:w="4320"/>
+            <w:tcW w:type="dxa" w:w="3216"/>
           </w:tcPr>
           <w:p>
             <w:r>
-              <w:t>🔵 Blauw</w:t>
+              <w:t>🔵 Blauw (cilinder)</w:t>
             </w:r>
           </w:p>
         </w:tc>
         <w:tc>
           <w:tcPr>
-            <w:tcW w:type="dxa" w:w="4320"/>
+            <w:tcW w:type="dxa" w:w="3216"/>
           </w:tcPr>
           <w:p>
             <w:r>
-              <w:t>Database-operaties</w:t>
+              <w:t>#bbdefb</w:t>
+            </w:r>
+          </w:p>
+        </w:tc>
+        <w:tc>
+          <w:tcPr>
+            <w:tcW w:type="dxa" w:w="3216"/>
+          </w:tcPr>
+          <w:p>
+            <w:r>
+              <w:t>Database-views / SQL-queries / Oracle-operaties</w:t>
+            </w:r>
+          </w:p>
+        </w:tc>
+      </w:tr>
+      <w:tr>
+        <w:tc>
+          <w:tcPr>
+            <w:tcW w:type="dxa" w:w="3216"/>
+          </w:tcPr>
+          <w:p>
+            <w:r>
+              <w:t>⬜ Grijs (rechthoek)</w:t>
+            </w:r>
+          </w:p>
+        </w:tc>
+        <w:tc>
+          <w:tcPr>
+            <w:tcW w:type="dxa" w:w="3216"/>
+          </w:tcPr>
+          <w:p>
+            <w:r>
+              <w:t>#f5f5f5</w:t>
+            </w:r>
+          </w:p>
+        </w:tc>
+        <w:tc>
+          <w:tcPr>
+            <w:tcW w:type="dxa" w:w="3216"/>
+          </w:tcPr>
+          <w:p>
+            <w:r>
+              <w:t>Verwerking / processtap</w:t>
             </w:r>
           </w:p>
         </w:tc>
       </w:tr>
     </w:tbl>
+    <w:p/>
     <w:p>
       <w:pPr>
         <w:pStyle w:val="Heading2"/>
@@ -304,12 +303,12 @@
         <w:pStyle w:val="Heading3"/>
       </w:pPr>
       <w:r>
-        <w:t>1. Gebruikersinteractie</w:t>
+        <w:t>Fase 1 – Gebruikersinteractie</w:t>
       </w:r>
     </w:p>
     <w:p>
       <w:r>
-        <w:t>De gebruiker klikt op de Afwijsredenen Tab. Indien de tab nog niet geïnitialiseerd is, worden de UI-componenten aangemaakt.</w:t>
+        <w:t>De gebruiker klikt op de Afwijsredenen Tab. Als de tab nog niet bestaat, worden de UI-componenten aangemaakt: AfwijsredenenSubTab, NOWAfwijsredenenGridPanel en NOWAfwijsredenenGrid. De grid krijgt de configuratie setAllRowsVisible=true, SelectionMode.NONE en de kolom Omschrijving.</w:t>
       </w:r>
     </w:p>
     <w:p>
@@ -317,18 +316,12 @@
         <w:pStyle w:val="Heading3"/>
       </w:pPr>
       <w:r>
-        <w:t>2. UI-initialisatie</w:t>
+        <w:t>Fase 2 – Data Provider &amp; Trigger</w:t>
       </w:r>
     </w:p>
     <w:p>
       <w:r>
-        <w:t>Er worden drie componenten aangemaakt:</w:t>
-        <w:br/>
-        <w:t>• AfwijsredenenSubTab — de tabbladcontainer</w:t>
-        <w:br/>
-        <w:t>• NOWAfwijsredenenGridPanel — het paneel rondom de grid</w:t>
-        <w:br/>
-        <w:t>• NOWAfwijsredenenGrid — de datagrid met configuratie (setAllRowsVisible, SelectionMode.NONE, kolom Omschrijving)</w:t>
+        <w:t>Na initialisatie koppelt de grid een Vaadin data provider via setItemsPageable. Zodra de tab zichtbaar wordt, triggert Vaadin automatisch de methode fetchData.</w:t>
       </w:r>
     </w:p>
     <w:p>
@@ -336,12 +329,12 @@
         <w:pStyle w:val="Heading3"/>
       </w:pPr>
       <w:r>
-        <w:t>3. Data Provider Setup</w:t>
+        <w:t>Fase 3 – LHNR-controle</w:t>
       </w:r>
     </w:p>
     <w:p>
       <w:r>
-        <w:t>De grid wordt geconfigureerd met een Vaadin data provider via setItemsPageable.</w:t>
+        <w:t>fetchData controleert of er een LHNR beschikbaar is. Zo niet, dan wordt een lege lijst teruggegeven en toont de grid "Geen gegevens beschikbaar".</w:t>
       </w:r>
     </w:p>
     <w:p>
@@ -349,12 +342,12 @@
         <w:pStyle w:val="Heading3"/>
       </w:pPr>
       <w:r>
-        <w:t>4. Data Fetch Trigger</w:t>
+        <w:t>Fase 4 – Service &amp; DAO</w:t>
       </w:r>
     </w:p>
     <w:p>
       <w:r>
-        <w:t>Zodra de tab zichtbaar wordt, triggert Vaadin automatisch een data-ophaalactie (fetchData).</w:t>
+        <w:t>NOWService.findAfwijsredenen(config, lhnr) wordt aangeroepen. De service haalt de AfwijsredenenDao op en delegeert de databasequery.</w:t>
       </w:r>
     </w:p>
     <w:p>
@@ -362,12 +355,19 @@
         <w:pStyle w:val="Heading3"/>
       </w:pPr>
       <w:r>
-        <w:t>5. Service Logic</w:t>
+        <w:t>Fase 5 – Query bepaling (regelingId)</w:t>
       </w:r>
     </w:p>
     <w:p>
       <w:r>
-        <w:t>NOWService.findAfwijsredenen(config, lhnr) wordt aangeroepen. De service haalt de AfwijsredenenDao op en delegeert de query.</w:t>
+        <w:t>• regelingId == 1  →  view RAN_NOW1_AFWIJSREDENEN_VW</w:t>
+        <w:br/>
+        <w:t xml:space="preserve">  Bind-parameter: LHNR</w:t>
+        <w:br/>
+        <w:br/>
+        <w:t>• anders  →  view RAN_NOWX_AFWIJSREDENEN_VW</w:t>
+        <w:br/>
+        <w:t xml:space="preserve">  Bind-parameters: LHNR + regelingId</w:t>
       </w:r>
     </w:p>
     <w:p>
@@ -375,16 +375,12 @@
         <w:pStyle w:val="Heading3"/>
       </w:pPr>
       <w:r>
-        <w:t>6. Query Bepaling</w:t>
+        <w:t>Fase 6 – Database &amp; Mapping</w:t>
       </w:r>
     </w:p>
     <w:p>
       <w:r>
-        <w:t>De DAO bepaalt welke view gebruikt wordt op basis van regelingId:</w:t>
-        <w:br/>
-        <w:t>• regelingId == 1 → RAN_NOW1_AFWIJSREDENEN_VW</w:t>
-        <w:br/>
-        <w:t>• anders → RAN_NOWX_AFWIJSREDENEN_VW</w:t>
+        <w:t>De native SQL-query draait op de Oracle Database. De resultset wordt als Stream&lt;NOWAfwijsredenEntity&gt; geretourneerd. De service mapt elke entity naar een NOWAfwijsredenBean via CopyProperties en verzamelt alles in een List.</w:t>
       </w:r>
     </w:p>
     <w:p>
@@ -392,43 +388,17 @@
         <w:pStyle w:val="Heading3"/>
       </w:pPr>
       <w:r>
-        <w:t>7. Database Query</w:t>
+        <w:t>Fase 7 – Grid Rendering</w:t>
       </w:r>
     </w:p>
     <w:p>
       <w:r>
-        <w:t>Een native SQL-query wordt uitgevoerd tegen de Oracle Database.</w:t>
-      </w:r>
-    </w:p>
-    <w:p>
-      <w:pPr>
-        <w:pStyle w:val="Heading3"/>
-      </w:pPr>
-      <w:r>
-        <w:t>8. Data Mapping</w:t>
-      </w:r>
-    </w:p>
-    <w:p>
-      <w:r>
-        <w:t>De Stream&lt;NOWAfwijsredenEntity&gt; wordt via CopyProperties omgezet naar List&lt;NOWAfwijsredenBean&gt;.</w:t>
-      </w:r>
-    </w:p>
-    <w:p>
-      <w:pPr>
-        <w:pStyle w:val="Heading3"/>
-      </w:pPr>
-      <w:r>
-        <w:t>9. Grid Rendering</w:t>
-      </w:r>
-    </w:p>
-    <w:p>
-      <w:r>
-        <w:t>De lijst wordt teruggegeven aan de grid, die de rijen toont en de hoogte dynamisch aanpast aan het aantal resultaten.</w:t>
+        <w:t>De lijst wordt aan de Vaadin-grid teruggegeven. De grid rendert elke bean als een rij en past de hoogte dynamisch aan het aantal resultaten aan. De gebruiker ziet de afwijsredenen.</w:t>
       </w:r>
     </w:p>
     <w:sectPr>
       <w:pgSz w:w="12240" w:h="15840"/>
-      <w:pgMar w:top="1440" w:right="1800" w:bottom="1440" w:left="1800" w:header="720" w:footer="720" w:gutter="0"/>
+      <w:pgMar w:top="1080" w:right="1296" w:bottom="1080" w:left="1296" w:header="720" w:footer="720" w:gutter="0"/>
       <w:cols w:space="720"/>
       <w:docGrid w:linePitch="360"/>
     </w:sectPr>

</xml_diff>